<commit_message>
feat: add certificate templates for PDF generation
</commit_message>
<xml_diff>
--- a/ied-be/src/templates/certificates/ied.docx
+++ b/ied-be/src/templates/certificates/ied.docx
@@ -242,8 +242,8 @@
               <w:ind/>
               <w:jc w:val="center"/>
               <w:rPr>
-                <w:sz w:val="72"/>
-                <w:szCs w:val="72"/>
+                <w:sz w:val="52"/>
+                <w:szCs w:val="52"/>
               </w:rPr>
             </w:pPr>
             <w:r>
@@ -253,21 +253,21 @@
                 <w:bCs/>
                 <w:color w:val="1b3a6b"/>
                 <w:spacing w:val="400"/>
-                <w:sz w:val="72"/>
-                <w:szCs w:val="72"/>
+                <w:sz w:val="52"/>
+                <w:szCs w:val="52"/>
               </w:rPr>
               <w:t xml:space="preserve">S E R T I F I K A T</w:t>
             </w:r>
             <w:r>
               <w:rPr>
-                <w:sz w:val="72"/>
-                <w:szCs w:val="72"/>
+                <w:sz w:val="52"/>
+                <w:szCs w:val="52"/>
               </w:rPr>
             </w:r>
             <w:r>
               <w:rPr>
-                <w:sz w:val="72"/>
-                <w:szCs w:val="72"/>
+                <w:sz w:val="52"/>
+                <w:szCs w:val="52"/>
               </w:rPr>
             </w:r>
           </w:p>
@@ -355,8 +355,8 @@
                 <w:bCs/>
                 <w:i/>
                 <w:color w:val="1a1a1a"/>
-                <w:sz w:val="30"/>
-                <w:szCs w:val="30"/>
+                <w:sz w:val="72"/>
+                <w:szCs w:val="72"/>
                 <w:highlight w:val="none"/>
               </w:rPr>
             </w:pPr>
@@ -368,8 +368,8 @@
                 <w:i/>
                 <w:iCs/>
                 <w:color w:val="1a1a1a"/>
-                <w:sz w:val="30"/>
-                <w:szCs w:val="30"/>
+                <w:sz w:val="72"/>
+                <w:szCs w:val="72"/>
               </w:rPr>
               <w:t xml:space="preserve">{seminar_naziv}</w:t>
             </w:r>
@@ -380,8 +380,8 @@
                 <w:bCs/>
                 <w:i/>
                 <w:color w:val="1a1a1a"/>
-                <w:sz w:val="30"/>
-                <w:szCs w:val="30"/>
+                <w:sz w:val="72"/>
+                <w:szCs w:val="72"/>
                 <w:highlight w:val="none"/>
               </w:rPr>
             </w:r>
@@ -389,83 +389,103 @@
           <w:p>
             <w:pPr>
               <w:pBdr/>
-              <w:spacing w:after="0" w:before="0" w:line="276" w:lineRule="auto"/>
+              <w:spacing w:after="80" w:before="0" w:line="276" w:lineRule="auto"/>
               <w:ind/>
               <w:jc w:val="center"/>
-              <w:rPr/>
+              <w:rPr>
+                <w:rFonts w:ascii="Times New Roman" w:hAnsi="Times New Roman" w:cs="Times New Roman"/>
+                <w:b/>
+                <w:bCs/>
+                <w:i/>
+                <w:color w:val="1a1a1a"/>
+                <w:sz w:val="72"/>
+                <w:szCs w:val="72"/>
+                <w:highlight w:val="none"/>
+              </w:rPr>
             </w:pPr>
             <w:r>
               <w:rPr>
                 <w:rFonts w:ascii="Times New Roman" w:hAnsi="Times New Roman" w:cs="Times New Roman"/>
+                <w:b/>
+                <w:bCs/>
                 <w:i/>
-                <w:iCs/>
-                <w:color w:val="666666"/>
-                <w:sz w:val="22"/>
-                <w:szCs w:val="22"/>
-                <w:lang w:val="sr-Latn"/>
+                <w:color w:val="1a1a1a"/>
+                <w:sz w:val="72"/>
+                <w:szCs w:val="72"/>
+                <w:highlight w:val="none"/>
               </w:rPr>
-              <w:t xml:space="preserve">za </w:t>
             </w:r>
             <w:r>
               <w:rPr>
                 <w:rFonts w:ascii="Times New Roman" w:hAnsi="Times New Roman" w:cs="Times New Roman"/>
                 <w:b/>
                 <w:bCs/>
-                <w:color w:val="1b3a6b"/>
-                <w:sz w:val="22"/>
-                <w:szCs w:val="22"/>
+                <w:i/>
+                <w:color w:val="1a1a1a"/>
+                <w:sz w:val="72"/>
+                <w:szCs w:val="72"/>
+                <w:highlight w:val="none"/>
               </w:rPr>
-              <w:t xml:space="preserve">{godina_seminara}</w:t>
             </w:r>
             <w:r>
               <w:rPr>
                 <w:rFonts w:ascii="Times New Roman" w:hAnsi="Times New Roman" w:cs="Times New Roman"/>
+                <w:b/>
+                <w:bCs/>
                 <w:i/>
-                <w:iCs/>
-                <w:color w:val="666666"/>
-                <w:sz w:val="22"/>
-                <w:szCs w:val="22"/>
+                <w:color w:val="1a1a1a"/>
+                <w:sz w:val="72"/>
+                <w:szCs w:val="72"/>
+                <w:highlight w:val="none"/>
               </w:rPr>
-              <w:t xml:space="preserve">. </w:t>
             </w:r>
-            <w:r>
-              <w:rPr>
-                <w:rFonts w:ascii="Times New Roman" w:hAnsi="Times New Roman" w:cs="Times New Roman"/>
-                <w:i/>
-                <w:iCs/>
-                <w:color w:val="666666"/>
-                <w:sz w:val="22"/>
-                <w:szCs w:val="22"/>
-                <w:lang w:val="sr-Latn"/>
-              </w:rPr>
-              <w:t xml:space="preserve">godinu</w:t>
-            </w:r>
-            <w:r/>
           </w:p>
           <w:p>
             <w:pPr>
-              <w:pBdr/>
-              <w:spacing w:after="60" w:before="0" w:line="276" w:lineRule="auto"/>
+              <w:pBdr>
+                <w:bottom w:val="single" w:color="1b3a6b" w:sz="6" w:space="1"/>
+              </w:pBdr>
+              <w:spacing w:after="0" w:before="0" w:line="276" w:lineRule="auto"/>
               <w:ind/>
-              <w:jc w:val="left"/>
-              <w:rPr/>
+              <w:jc w:val="center"/>
+              <w:rPr>
+                <w:rFonts w:ascii="Times New Roman" w:hAnsi="Times New Roman" w:cs="Times New Roman"/>
+                <w:b/>
+                <w:bCs/>
+                <w:color w:val="1b3a6b"/>
+                <w:sz w:val="72"/>
+                <w:szCs w:val="72"/>
+                <w:highlight w:val="none"/>
+              </w:rPr>
             </w:pPr>
             <w:r>
               <w:rPr>
                 <w:rFonts w:ascii="Times New Roman" w:hAnsi="Times New Roman" w:cs="Times New Roman"/>
-                <w:i/>
-                <w:iCs/>
-                <w:color w:val="666666"/>
-                <w:sz w:val="18"/>
-                <w:szCs w:val="18"/>
+                <w:b/>
+                <w:bCs/>
+                <w:color w:val="1b3a6b"/>
+                <w:sz w:val="72"/>
+                <w:szCs w:val="72"/>
               </w:rPr>
+            </w:r>
+            <w:r/>
+            <w:r>
+              <w:rPr>
+                <w:rFonts w:ascii="Times New Roman" w:hAnsi="Times New Roman" w:cs="Times New Roman"/>
+                <w:b/>
+                <w:bCs/>
+                <w:color w:val="1b3a6b"/>
+                <w:sz w:val="72"/>
+                <w:szCs w:val="72"/>
+              </w:rPr>
+              <w:t xml:space="preserve">{ime_prezime}</w:t>
             </w:r>
             <w:r/>
           </w:p>
           <w:p>
             <w:pPr>
               <w:pBdr>
-                <w:bottom w:val="single" w:color="1b3a6b" w:sz="6" w:space="1"/>
+                <w:bottom w:val="single" w:color="1b3a6b" w:sz="6" w:space="0"/>
               </w:pBdr>
               <w:spacing w:after="0" w:before="0" w:line="276" w:lineRule="auto"/>
               <w:ind/>
@@ -480,84 +500,8 @@
                 <w:color w:val="1b3a6b"/>
                 <w:sz w:val="72"/>
                 <w:szCs w:val="72"/>
+                <w:highlight w:val="none"/>
               </w:rPr>
-            </w:r>
-            <w:r>
-              <mc:AlternateContent>
-                <mc:Choice Requires="wpg">
-                  <w:drawing>
-                    <wp:anchor xmlns:wp="http://schemas.openxmlformats.org/drawingml/2006/wordprocessingDrawing" xmlns:wp14="http://schemas.microsoft.com/office/word/2010/wordprocessingDrawing" distT="0" distB="0" distL="115200" distR="115200" simplePos="0" relativeHeight="3072" behindDoc="0" locked="0" layoutInCell="1" allowOverlap="1">
-                      <wp:simplePos x="0" y="0"/>
-                      <wp:positionH relativeFrom="column">
-                        <wp:posOffset>6503559</wp:posOffset>
-                      </wp:positionH>
-                      <wp:positionV relativeFrom="paragraph">
-                        <wp:posOffset>89483</wp:posOffset>
-                      </wp:positionV>
-                      <wp:extent cx="2467832" cy="1380811"/>
-                      <wp:effectExtent l="0" t="0" r="0" b="0"/>
-                      <wp:wrapNone/>
-                      <wp:docPr id="2" name=""/>
-                      <wp:cNvGraphicFramePr>
-                        <a:graphicFrameLocks xmlns:a="http://schemas.openxmlformats.org/drawingml/2006/main" noChangeAspect="1"/>
-                      </wp:cNvGraphicFramePr>
-                      <a:graphic xmlns:a="http://schemas.openxmlformats.org/drawingml/2006/main">
-                        <a:graphicData uri="http://schemas.openxmlformats.org/drawingml/2006/picture">
-                          <pic:pic xmlns:pic="http://schemas.openxmlformats.org/drawingml/2006/picture">
-                            <pic:nvPicPr>
-                              <pic:cNvPr id="196000181" name=""/>
-                              <pic:cNvPicPr>
-                                <a:picLocks noChangeAspect="1"/>
-                              </pic:cNvPicPr>
-                              <pic:nvPr/>
-                            </pic:nvPicPr>
-                            <pic:blipFill rotWithShape="1">
-                              <a:blip r:embed="rId10"/>
-                              <a:stretch/>
-                            </pic:blipFill>
-                            <pic:spPr bwMode="auto">
-                              <a:xfrm flipH="0" flipV="0">
-                                <a:off x="0" y="0"/>
-                                <a:ext cx="2467831" cy="1380810"/>
-                              </a:xfrm>
-                              <a:prstGeom prst="rect">
-                                <a:avLst/>
-                              </a:prstGeom>
-                            </pic:spPr>
-                          </pic:pic>
-                        </a:graphicData>
-                      </a:graphic>
-                    </wp:anchor>
-                  </w:drawing>
-                </mc:Choice>
-                <mc:Fallback>
-                  <w:pict>
-                    <v:shapetype id="_x0000_t75" coordsize="21600,21600" o:spt="75" o:preferrelative="t" path="m@4@5l@4@11@9@11@9@5xe" filled="f" stroked="f">
-                      <v:stroke joinstyle="miter"/>
-                      <v:formulas>
-                        <v:f eqn="if lineDrawn pixelLineWidth 0"/>
-                        <v:f eqn="sum @0 1 0"/>
-                        <v:f eqn="sum 0 0 @1"/>
-                        <v:f eqn="prod @2 1 2"/>
-                        <v:f eqn="prod @3 21600 pixelWidth"/>
-                        <v:f eqn="prod @3 21600 pixelHeight"/>
-                        <v:f eqn="sum @0 0 1"/>
-                        <v:f eqn="prod @6 1 2"/>
-                        <v:f eqn="prod @7 21600 pixelWidth"/>
-                        <v:f eqn="sum @8 21600 0"/>
-                        <v:f eqn="prod @7 21600 pixelHeight"/>
-                        <v:f eqn="sum @10 21600 0"/>
-                      </v:formulas>
-                      <v:path o:extrusionok="f" gradientshapeok="t" o:connecttype="rect"/>
-                      <o:lock v:ext="edit" aspectratio="t"/>
-                    </v:shapetype>
-                    <v:shape id="_x0000_i1" o:spid="_x0000_s1" type="#_x0000_t75" style="position:absolute;z-index:3072;o:allowoverlap:true;o:allowincell:true;mso-position-horizontal-relative:text;margin-left:512.09pt;mso-position-horizontal:absolute;mso-position-vertical-relative:text;margin-top:7.05pt;mso-position-vertical:absolute;width:194.32pt;height:108.73pt;mso-wrap-distance-left:9.07pt;mso-wrap-distance-top:0.00pt;mso-wrap-distance-right:9.07pt;mso-wrap-distance-bottom:0.00pt;z-index:1;" stroked="false">
-                      <v:imagedata r:id="rId10" o:title=""/>
-                      <o:lock v:ext="edit" rotation="t"/>
-                    </v:shape>
-                  </w:pict>
-                </mc:Fallback>
-              </mc:AlternateContent>
             </w:r>
             <w:r>
               <w:rPr>
@@ -567,18 +511,20 @@
                 <w:color w:val="1b3a6b"/>
                 <w:sz w:val="72"/>
                 <w:szCs w:val="72"/>
+                <w:highlight w:val="none"/>
               </w:rPr>
-              <w:t xml:space="preserve">{ime_prezime}</w:t>
             </w:r>
             <w:r>
               <w:rPr>
                 <w:rFonts w:ascii="Times New Roman" w:hAnsi="Times New Roman" w:cs="Times New Roman"/>
+                <w:b/>
+                <w:bCs/>
                 <w:color w:val="1b3a6b"/>
-                <w:sz w:val="20"/>
-                <w:szCs w:val="20"/>
+                <w:sz w:val="72"/>
+                <w:szCs w:val="72"/>
+                <w:highlight w:val="none"/>
               </w:rPr>
             </w:r>
-            <w:r/>
           </w:p>
           <w:tbl>
             <w:tblPr>
@@ -651,6 +597,12 @@
                       <w:szCs w:val="22"/>
                     </w:rPr>
                   </w:r>
+                  <w:r>
+                    <w:rPr>
+                      <w:sz w:val="22"/>
+                      <w:szCs w:val="22"/>
+                    </w:rPr>
+                  </w:r>
                 </w:p>
               </w:tc>
               <w:tc>
@@ -716,6 +668,12 @@
                       <w:szCs w:val="22"/>
                     </w:rPr>
                   </w:r>
+                  <w:r>
+                    <w:rPr>
+                      <w:sz w:val="22"/>
+                      <w:szCs w:val="22"/>
+                    </w:rPr>
+                  </w:r>
                 </w:p>
               </w:tc>
               <w:tc>
@@ -729,29 +687,6 @@
                   <w:tcW w:w="4813" w:type="dxa"/>
                   <w:vAlign w:val="center"/>
                 </w:tcPr>
-                <w:p>
-                  <w:pPr>
-                    <w:pBdr>
-                      <w:top w:val="single" w:color="1b3a6b" w:sz="4" w:space="1"/>
-                    </w:pBdr>
-                    <w:spacing w:after="0" w:before="400" w:line="276" w:lineRule="auto"/>
-                    <w:ind/>
-                    <w:jc w:val="center"/>
-                    <w:rPr/>
-                  </w:pPr>
-                  <w:r>
-                    <w:rPr>
-                      <w:rFonts w:ascii="Times New Roman" w:hAnsi="Times New Roman" w:cs="Times New Roman"/>
-                      <w:b/>
-                      <w:bCs/>
-                      <w:color w:val="1b3a6b"/>
-                      <w:sz w:val="22"/>
-                      <w:szCs w:val="22"/>
-                    </w:rPr>
-                    <w:t xml:space="preserve">Bogdan Raičević</w:t>
-                  </w:r>
-                  <w:r/>
-                </w:p>
                 <w:p>
                   <w:pPr>
                     <w:pBdr/>
@@ -769,7 +704,7 @@
                       <w:sz w:val="20"/>
                       <w:szCs w:val="20"/>
                     </w:rPr>
-                    <w:t xml:space="preserve">direktor</w:t>
+                    <w:t xml:space="preserve">Institut Za Ekonomsku Diplomatiju</w:t>
                   </w:r>
                   <w:r/>
                 </w:p>

</xml_diff>